<commit_message>
modificacion de index.html y readme.md
</commit_message>
<xml_diff>
--- a/docs/manual/Manual de uso Convertidor TXT-XML.docx
+++ b/docs/manual/Manual de uso Convertidor TXT-XML.docx
@@ -103,7 +103,6 @@
                                   <w:dataBinding w:prefixMappings="xmlns:ns0='http://purl.org/dc/elements/1.1/' xmlns:ns1='http://schemas.openxmlformats.org/package/2006/metadata/core-properties' " w:xpath="/ns1:coreProperties[1]/ns0:title[1]" w:storeItemID="{6C3C8BC8-F283-45AE-878A-BAB7291924A1}"/>
                                   <w:text/>
                                 </w:sdtPr>
-                                <w:sdtEndPr/>
                                 <w:sdtContent>
                                   <w:p>
                                     <w:pPr>
@@ -155,7 +154,6 @@
                                     <w:dataBinding w:prefixMappings="xmlns:ns0='http://purl.org/dc/elements/1.1/' xmlns:ns1='http://schemas.openxmlformats.org/package/2006/metadata/core-properties' " w:xpath="/ns1:coreProperties[1]/ns0:subject[1]" w:storeItemID="{6C3C8BC8-F283-45AE-878A-BAB7291924A1}"/>
                                     <w:text/>
                                   </w:sdtPr>
-                                  <w:sdtEndPr/>
                                   <w:sdtContent>
                                     <w:r>
                                       <w:rPr>
@@ -217,7 +215,6 @@
                             <w:dataBinding w:prefixMappings="xmlns:ns0='http://purl.org/dc/elements/1.1/' xmlns:ns1='http://schemas.openxmlformats.org/package/2006/metadata/core-properties' " w:xpath="/ns1:coreProperties[1]/ns0:title[1]" w:storeItemID="{6C3C8BC8-F283-45AE-878A-BAB7291924A1}"/>
                             <w:text/>
                           </w:sdtPr>
-                          <w:sdtEndPr/>
                           <w:sdtContent>
                             <w:p>
                               <w:pPr>
@@ -269,7 +266,6 @@
                               <w:dataBinding w:prefixMappings="xmlns:ns0='http://purl.org/dc/elements/1.1/' xmlns:ns1='http://schemas.openxmlformats.org/package/2006/metadata/core-properties' " w:xpath="/ns1:coreProperties[1]/ns0:subject[1]" w:storeItemID="{6C3C8BC8-F283-45AE-878A-BAB7291924A1}"/>
                               <w:text/>
                             </w:sdtPr>
-                            <w:sdtEndPr/>
                             <w:sdtContent>
                               <w:r>
                                 <w:rPr>
@@ -912,7 +908,6 @@
                                     <w:dataBinding w:prefixMappings="xmlns:ns0='http://schemas.openxmlformats.org/officeDocument/2006/extended-properties' " w:xpath="/ns0:Properties[1]/ns0:Company[1]" w:storeItemID="{6668398D-A668-4E3E-A5EB-62B293D839F1}"/>
                                     <w:text/>
                                   </w:sdtPr>
-                                  <w:sdtEndPr/>
                                   <w:sdtContent>
                                     <w:r>
                                       <w:rPr>
@@ -949,7 +944,6 @@
                                   <w:dataBinding w:prefixMappings="xmlns:ns0='http://purl.org/dc/elements/1.1/' xmlns:ns1='http://schemas.openxmlformats.org/package/2006/metadata/core-properties' " w:xpath="/ns1:coreProperties[1]/ns1:category[1]" w:storeItemID="{6C3C8BC8-F283-45AE-878A-BAB7291924A1}"/>
                                   <w:text/>
                                 </w:sdtPr>
-                                <w:sdtEndPr/>
                                 <w:sdtContent>
                                   <w:p>
                                     <w:pPr>
@@ -1024,7 +1018,6 @@
                               <w:dataBinding w:prefixMappings="xmlns:ns0='http://schemas.openxmlformats.org/officeDocument/2006/extended-properties' " w:xpath="/ns0:Properties[1]/ns0:Company[1]" w:storeItemID="{6668398D-A668-4E3E-A5EB-62B293D839F1}"/>
                               <w:text/>
                             </w:sdtPr>
-                            <w:sdtEndPr/>
                             <w:sdtContent>
                               <w:r>
                                 <w:rPr>
@@ -1061,7 +1054,6 @@
                             <w:dataBinding w:prefixMappings="xmlns:ns0='http://purl.org/dc/elements/1.1/' xmlns:ns1='http://schemas.openxmlformats.org/package/2006/metadata/core-properties' " w:xpath="/ns1:coreProperties[1]/ns1:category[1]" w:storeItemID="{6C3C8BC8-F283-45AE-878A-BAB7291924A1}"/>
                             <w:text/>
                           </w:sdtPr>
-                          <w:sdtEndPr/>
                           <w:sdtContent>
                             <w:p>
                               <w:pPr>
@@ -2047,50 +2039,93 @@
       </w:r>
       <w:bookmarkEnd w:id="0"/>
     </w:p>
+    <w:p>
+      <w:pPr>
+        <w:jc w:val="both"/>
+      </w:pPr>
+      <w:r>
+        <w:t>El software Convertidor TXT-XML permite transformar archivos .txt</w:t>
+      </w:r>
+      <w:r>
+        <w:t xml:space="preserve">, </w:t>
+      </w:r>
+      <w:r>
+        <w:t>incluyendo</w:t>
+      </w:r>
+      <w:r>
+        <w:t xml:space="preserve"> las listas de picos de MALDI-TOF generadas por sistemas como Vitek MS / Saramis RUO</w:t>
+      </w:r>
+      <w:r>
+        <w:t>, al formato .xml compatible con la plataforma Microbe</w:t>
+      </w:r>
+      <w:r>
+        <w:t>N</w:t>
+      </w:r>
+      <w:r>
+        <w:t>et de CDC.</w:t>
+      </w:r>
+    </w:p>
+    <w:p>
+      <w:pPr>
+        <w:jc w:val="both"/>
+      </w:pPr>
+      <w:r>
+        <w:t xml:space="preserve">Este documento describe </w:t>
+      </w:r>
+      <w:r>
+        <w:t>la descarga</w:t>
+      </w:r>
+      <w:r>
+        <w:t>/i</w:t>
+      </w:r>
+      <w:r>
+        <w:t>nstalación del software</w:t>
+      </w:r>
+      <w:r>
+        <w:t xml:space="preserve"> y</w:t>
+      </w:r>
+      <w:r>
+        <w:t xml:space="preserve"> </w:t>
+      </w:r>
+      <w:r>
+        <w:t xml:space="preserve">el flujo de trabajo habitual para realizar la conversión y posterior carga del archivo en </w:t>
+      </w:r>
+      <w:proofErr w:type="spellStart"/>
+      <w:r>
+        <w:t>Microbe</w:t>
+      </w:r>
+      <w:r>
+        <w:t>N</w:t>
+      </w:r>
+      <w:r>
+        <w:t>et</w:t>
+      </w:r>
+      <w:proofErr w:type="spellEnd"/>
+      <w:r>
+        <w:t xml:space="preserve"> (microbenet.cdc.gov).</w:t>
+      </w:r>
+    </w:p>
+    <w:p>
+      <w:pPr>
+        <w:jc w:val="both"/>
+      </w:pPr>
+    </w:p>
+    <w:p>
+      <w:pPr>
+        <w:pStyle w:val="Ttulo1"/>
+        <w:numPr>
+          <w:ilvl w:val="0"/>
+          <w:numId w:val="2"/>
+        </w:numPr>
+      </w:pPr>
+      <w:r>
+        <w:t>Descarga</w:t>
+      </w:r>
+      <w:r>
+        <w:t xml:space="preserve"> del Conversor TXT-XML</w:t>
+      </w:r>
+    </w:p>
     <w:p/>
-    <w:p>
-      <w:pPr>
-        <w:jc w:val="both"/>
-      </w:pPr>
-      <w:r>
-        <w:t>El software Convertidor TXT-XML permite transformar archivos .txt</w:t>
-      </w:r>
-      <w:r>
-        <w:t xml:space="preserve">, </w:t>
-      </w:r>
-      <w:r>
-        <w:t>incluyendo</w:t>
-      </w:r>
-      <w:r>
-        <w:t xml:space="preserve"> las listas de picos de MALDI-TOF generadas por sistemas como Vitek MS / Saramis RUO</w:t>
-      </w:r>
-      <w:r>
-        <w:t>, al formato .xml compatible con la plataforma Microbe</w:t>
-      </w:r>
-      <w:r>
-        <w:t>N</w:t>
-      </w:r>
-      <w:r>
-        <w:t>et de CDC.</w:t>
-      </w:r>
-    </w:p>
-    <w:p>
-      <w:pPr>
-        <w:jc w:val="both"/>
-      </w:pPr>
-      <w:r>
-        <w:t>Este documento describe el flujo de trabajo habitual para realizar la conversión y posterior carga del archivo en Microbe</w:t>
-      </w:r>
-      <w:r>
-        <w:t>N</w:t>
-      </w:r>
-      <w:r>
-        <w:t>et</w:t>
-      </w:r>
-      <w:r>
-        <w:t xml:space="preserve"> (microbenet.cdc.gov).</w:t>
-      </w:r>
-    </w:p>
     <w:p>
       <w:pPr>
         <w:pStyle w:val="Ttulo1"/>
@@ -5286,6 +5321,7 @@
   <w:style w:type="character" w:default="1" w:styleId="Fuentedeprrafopredeter">
     <w:name w:val="Default Paragraph Font"/>
     <w:uiPriority w:val="1"/>
+    <w:semiHidden/>
     <w:unhideWhenUsed/>
   </w:style>
   <w:style w:type="table" w:default="1" w:styleId="Tablanormal">

</xml_diff>